<commit_message>
Fix DOCX manuscript formatting: caps title, page-1 numbering, spelled-out chapters, scene breaks
Standard Manuscript Format DOCX export now matches a real submitted-manuscript
reference: title page title is always uppercase, page numbers start at 1 on the
first manuscript page (title page gets its own OOXML section with no header),
chapter headings spell out numbers ("Chapter One") and get real blank-paragraph
spacing before them instead of a space-before value Word silently drops at the
top of a page, and the manuscript ends with a centered "* * *".

Scene separators (default changed to "#") are now spliced in as raw OOXML
instead of being left as plain markdown text — a bare "#" or "* * *" line was
being parsed by pandoc as an empty heading or a thematic break/horizontal-rule
object respectively, silently destroying the separator.

Also includes the in-progress pasted-text normalizer for the scene editor.

Co-Authored-By: Claude Sonnet 5 <noreply@anthropic.com>
</commit_message>
<xml_diff>
--- a/Sources/DrafterApp/Resources/DOCX/reference.docx
+++ b/Sources/DrafterApp/Resources/DOCX/reference.docx
@@ -314,11 +314,13 @@
       </w:r>
     </w:p>
     <w:sectPr>
+      <w:headerReference w:type="default" r:id="rId9"/>
       <w:footnotePr>
         <w:numRestart w:val="eachSect"/>
       </w:footnotePr>
       <w:pgSz w:w="12240" w:h="15840"/>
       <w:pgMar w:top="1440" w:right="1440" w:bottom="1440" w:left="1440" w:header="720" w:footer="720" w:gutter="0"/>
+      <w:pgNumType w:start="1"/>
     </w:sectPr>
   </w:body>
 </w:document>
@@ -371,6 +373,24 @@
 </w:footnotes>
 </file>
 
+<file path=word/header1.xml><?xml version="1.0" encoding="utf-8"?>
+<w:hdr xmlns:w="http://schemas.openxmlformats.org/wordprocessingml/2006/main">
+  <w:p>
+    <w:pPr>
+      <w:pStyle w:val="SMFHeader"/>
+    </w:pPr>
+    <w:r>
+      <w:t xml:space="preserve">AUTHORLASTNAME / MANUSCRIPTTITLE / </w:t>
+    </w:r>
+    <w:fldSimple w:instr="PAGE">
+      <w:r>
+        <w:t>1</w:t>
+      </w:r>
+    </w:fldSimple>
+  </w:p>
+</w:hdr>
+</file>
+
 <file path=word/numbering.xml><?xml version="1.0" encoding="utf-8"?>
 <w:numbering xmlns:w="http://schemas.openxmlformats.org/wordprocessingml/2006/main">
   <w:abstractNum w:abstractNumId="990">
@@ -482,632 +502,578 @@
 </w:numbering>
 </file>
 
-<file path=word/styles.xml><?xml version="1.0" encoding="UTF-8"?>
+<file path=word/styles.xml><?xml version="1.0" encoding="utf-8"?>
 <w:styles xmlns:r="http://schemas.openxmlformats.org/officeDocument/2006/relationships" xmlns:w="http://schemas.openxmlformats.org/wordprocessingml/2006/main">
   <w:docDefaults>
     <w:rPrDefault>
       <w:rPr>
-        <w:rFonts w:ascii="Times New Roman" w:eastAsia="Times New Roman" w:hAnsi="Times New Roman" w:cs="Times New Roman" />
-        <w:sz w:val="24" />
-        <w:szCs w:val="24" />
-        <w:lang w:val="en-US" w:eastAsia="zh-CN" w:bidi="ar-SA" />
+        <w:rFonts w:ascii="Times New Roman" w:eastAsia="Times New Roman" w:hAnsi="Times New Roman" w:cs="Times New Roman"/>
+        <w:sz w:val="24"/>
+        <w:szCs w:val="24"/>
+        <w:lang w:val="en-US" w:eastAsia="zh-CN" w:bidi="ar-SA"/>
       </w:rPr>
     </w:rPrDefault>
     <w:pPrDefault>
       <w:pPr>
-        <w:spacing w:after="0" w:line="480" w:lineRule="auto" />
+        <w:spacing w:after="0" w:line="480" w:lineRule="auto"/>
       </w:pPr>
     </w:pPrDefault>
   </w:docDefaults>
-  <w:latentStyles w:defLockedState="0" w:defUIPriority="0" w:defSemiHidden="0" w:defUnhideWhenUsed="0" w:defQFormat="0" w:count="276" />
+  <w:latentStyles w:defLockedState="0" w:defUIPriority="0" w:defSemiHidden="0" w:defUnhideWhenUsed="0" w:defQFormat="0" w:count="276"/>
   <!-- Standard submission-manuscript format (Shunn): 12pt Times New Roman, double-spaced,
        no extra space between paragraphs, 0.5in first-line indent, left-aligned (not
-       justified) -- the format agents/publishers expect, distinct from the print PDF's
+       justified) — the format agents/publishers expect, distinct from the print PDF's
        finished-book typography. -->
   <w:style w:type="paragraph" w:default="1" w:styleId="Normal">
-    <w:name w:val="Normal" />
-    <w:qFormat />
-    <w:pPr>
-      <w:spacing w:after="0" w:line="480" w:lineRule="auto" />
-      <w:ind w:firstLine="720" />
-      <w:jc w:val="left" />
-    </w:pPr>
-    <w:rPr>
-      <w:rFonts w:ascii="Times New Roman" w:eastAsia="Times New Roman" w:hAnsi="Times New Roman" w:cs="Times New Roman" />
-      <w:sz w:val="24" />
-      <w:szCs w:val="24" />
+    <w:name w:val="Normal"/>
+    <w:qFormat/>
+    <w:pPr>
+      <w:spacing w:after="0" w:line="480" w:lineRule="auto"/>
+      <w:ind w:firstLine="720"/>
+      <w:jc w:val="left"/>
+    </w:pPr>
+    <w:rPr>
+      <w:rFonts w:ascii="Times New Roman" w:eastAsia="Times New Roman" w:hAnsi="Times New Roman" w:cs="Times New Roman"/>
+      <w:sz w:val="24"/>
+      <w:szCs w:val="24"/>
     </w:rPr>
   </w:style>
   <w:style w:type="paragraph" w:styleId="BodyText">
-    <w:name w:val="Body Text" />
-    <w:basedOn w:val="Normal" />
-    <w:link w:val="BodyTextChar" />
-    <w:qFormat />
-    <w:pPr>
-      <w:spacing w:before="0" w:after="0" w:line="480" w:lineRule="auto" />
-      <w:ind w:firstLine="720" />
-      <w:jc w:val="left" />
-    </w:pPr>
-  </w:style>
-  <!-- The paragraph directly after a chapter heading is conventionally NOT
-       first-line-indented in manuscript format. -->
+    <w:name w:val="Body Text"/>
+    <w:basedOn w:val="Normal"/>
+    <w:link w:val="BodyTextChar"/>
+    <w:qFormat/>
+    <w:pPr>
+      <w:spacing w:before="0" w:after="0" w:line="480" w:lineRule="auto"/>
+      <w:ind w:firstLine="720"/>
+      <w:jc w:val="left"/>
+    </w:pPr>
+  </w:style>
+  <!-- Applied by pandoc automatically to the paragraph immediately following a
+       heading. Per the real Shunn-format example measured for this feature, that
+       paragraph IS first-line-indented like every other body paragraph — no
+       flush-left exception — so this style intentionally adds nothing beyond what
+       BodyText already provides; it exists only because pandoc requires a style
+       literally named "First Paragraph" to target that paragraph at all. -->
   <w:style w:type="paragraph" w:customStyle="1" w:styleId="FirstParagraph">
-    <w:name w:val="First Paragraph" />
-    <w:basedOn w:val="BodyText" />
-    <w:next w:val="BodyText" />
-    <w:qFormat />
-    <w:pPr>
-      <w:ind w:firstLine="0" />
-    </w:pPr>
+    <w:name w:val="First Paragraph"/>
+    <w:basedOn w:val="BodyText"/>
+    <w:next w:val="BodyText"/>
+    <w:qFormat/>
   </w:style>
   <w:style w:type="paragraph" w:customStyle="1" w:styleId="Compact">
-    <w:name w:val="Compact" />
-    <w:basedOn w:val="BodyText" />
-    <w:qFormat />
-    <w:pPr>
-      <w:spacing w:before="36" w:after="36" />
+    <w:name w:val="Compact"/>
+    <w:basedOn w:val="BodyText"/>
+    <w:qFormat/>
+    <w:pPr>
+      <w:spacing w:before="36" w:after="36"/>
     </w:pPr>
   </w:style>
   <w:style w:type="paragraph" w:styleId="Title">
-    <w:name w:val="Title" />
-    <w:basedOn w:val="Normal" />
-    <w:next w:val="BodyText" />
-    <w:link w:val="TitleChar" />
-    <w:uiPriority w:val="10" />
-    <w:qFormat />
-    <w:rsid w:val="00A10FD9" />
-    <w:pPr>
-      <w:spacing w:after="80" w:line="240" w:lineRule="auto" />
-      <w:contextualSpacing />
-      <w:jc w:val="center" />
-    </w:pPr>
-    <w:rPr>
-      <w:rFonts w:asciiTheme="majorHAnsi"
-      w:eastAsiaTheme="majorEastAsia" w:hAnsiTheme="majorHAnsi"
-      w:cstheme="majorBidi" />
-      <w:sz w:val="56" />
-      <w:szCs w:val="56" />
-    </w:rPr>
-  </w:style>
-  <w:style w:type="character" w:customStyle="1"
-  w:styleId="TitleChar">
-    <w:name w:val="Title Char" />
-    <w:basedOn w:val="DefaultParagraphFont" />
-    <w:link w:val="Title" />
-    <w:uiPriority w:val="10" />
-    <w:rsid w:val="00A10FD9" />
-    <w:rPr>
-      <w:rFonts w:asciiTheme="majorHAnsi"
-      w:eastAsiaTheme="majorEastAsia" w:hAnsiTheme="majorHAnsi"
-      w:cstheme="majorBidi" />
-      <w:sz w:val="56" />
-      <w:szCs w:val="56" />
+    <w:name w:val="Title"/>
+    <w:basedOn w:val="Normal"/>
+    <w:next w:val="BodyText"/>
+    <w:link w:val="TitleChar"/>
+    <w:uiPriority w:val="10"/>
+    <w:qFormat/>
+    <w:rsid w:val="00A10FD9"/>
+    <w:pPr>
+      <w:spacing w:after="80" w:line="240" w:lineRule="auto"/>
+      <w:contextualSpacing/>
+      <w:jc w:val="center"/>
+    </w:pPr>
+    <w:rPr>
+      <w:rFonts w:asciiTheme="majorHAnsi" w:eastAsiaTheme="majorEastAsia" w:hAnsiTheme="majorHAnsi" w:cstheme="majorBidi"/>
+      <w:sz w:val="56"/>
+      <w:szCs w:val="56"/>
+    </w:rPr>
+  </w:style>
+  <w:style w:type="character" w:customStyle="1" w:styleId="TitleChar">
+    <w:name w:val="Title Char"/>
+    <w:basedOn w:val="DefaultParagraphFont"/>
+    <w:link w:val="Title"/>
+    <w:uiPriority w:val="10"/>
+    <w:rsid w:val="00A10FD9"/>
+    <w:rPr>
+      <w:rFonts w:asciiTheme="majorHAnsi" w:eastAsiaTheme="majorEastAsia" w:hAnsiTheme="majorHAnsi" w:cstheme="majorBidi"/>
+      <w:sz w:val="56"/>
+      <w:szCs w:val="56"/>
     </w:rPr>
   </w:style>
   <w:style w:type="paragraph" w:styleId="Subtitle">
-    <w:name w:val="Subtitle" />
-    <w:basedOn w:val="Title" />
-    <w:next w:val="BodyText" />
-    <w:link w:val="SubtitleChar" />
-    <w:uiPriority w:val="11" />
-    <w:qFormat />
-    <w:rsid w:val="00A10FD9" />
+    <w:name w:val="Subtitle"/>
+    <w:basedOn w:val="Title"/>
+    <w:next w:val="BodyText"/>
+    <w:link w:val="SubtitleChar"/>
+    <w:uiPriority w:val="11"/>
+    <w:qFormat/>
+    <w:rsid w:val="00A10FD9"/>
     <w:pPr>
       <w:numPr>
-        <w:ilvl w:val="1" />
+        <w:ilvl w:val="1"/>
       </w:numPr>
     </w:pPr>
     <w:rPr>
-      <w:rFonts w:eastAsiaTheme="majorEastAsia"
-      w:cstheme="majorBidi" />
-      <w:spacing w:val="15" />
-      <w:sz w:val="28" />
-      <w:szCs w:val="28" />
-    </w:rPr>
-  </w:style>
-  <w:style w:type="character" w:customStyle="1"
-  w:styleId="SubtitleChar">
-    <w:name w:val="Subtitle Char" />
-    <w:basedOn w:val="DefaultParagraphFont" />
-    <w:link w:val="Subtitle" />
-    <w:uiPriority w:val="11" />
-    <w:rsid w:val="00A10FD9" />
-    <w:rPr>
-      <w:rFonts w:eastAsiaTheme="majorEastAsia"
-      w:cstheme="majorBidi" />
-      <w:color w:val="595959" w:themeColor="text1"
-      w:themeTint="A6" />
-      <w:spacing w:val="15" />
-      <w:sz w:val="28" />
-      <w:szCs w:val="28" />
+      <w:rFonts w:eastAsiaTheme="majorEastAsia" w:cstheme="majorBidi"/>
+      <w:spacing w:val="15"/>
+      <w:sz w:val="28"/>
+      <w:szCs w:val="28"/>
+    </w:rPr>
+  </w:style>
+  <w:style w:type="character" w:customStyle="1" w:styleId="SubtitleChar">
+    <w:name w:val="Subtitle Char"/>
+    <w:basedOn w:val="DefaultParagraphFont"/>
+    <w:link w:val="Subtitle"/>
+    <w:uiPriority w:val="11"/>
+    <w:rsid w:val="00A10FD9"/>
+    <w:rPr>
+      <w:rFonts w:eastAsiaTheme="majorEastAsia" w:cstheme="majorBidi"/>
+      <w:color w:val="595959" w:themeColor="text1" w:themeTint="A6"/>
+      <w:spacing w:val="15"/>
+      <w:sz w:val="28"/>
+      <w:szCs w:val="28"/>
     </w:rPr>
   </w:style>
   <w:style w:type="paragraph" w:customStyle="1" w:styleId="Author">
-    <w:name w:val="Author" />
-    <w:basedOn w:val="Title" />
-    <w:next w:val="BodyText" />
-    <w:qFormat />
-    <w:pPr>
-      <w:keepNext />
-      <w:keepLines />
-    </w:pPr>
-    <w:rPr>
-      <w:sz w:val="24" />
-      <w:szCs w:val="24" />
+    <w:name w:val="Author"/>
+    <w:basedOn w:val="Title"/>
+    <w:next w:val="BodyText"/>
+    <w:qFormat/>
+    <w:pPr>
+      <w:keepNext/>
+      <w:keepLines/>
+    </w:pPr>
+    <w:rPr>
+      <w:sz w:val="24"/>
+      <w:szCs w:val="24"/>
     </w:rPr>
   </w:style>
   <w:style w:type="paragraph" w:styleId="Date">
-    <w:name w:val="Date" />
-    <w:basedOn w:val="Title" />
-    <w:next w:val="BodyText" />
-    <w:qFormat />
-    <w:pPr>
-      <w:keepNext />
-      <w:keepLines />
-    </w:pPr>
-    <w:rPr>
-      <w:sz w:val="24" />
-      <w:szCs w:val="24" />
+    <w:name w:val="Date"/>
+    <w:basedOn w:val="Title"/>
+    <w:next w:val="BodyText"/>
+    <w:qFormat/>
+    <w:pPr>
+      <w:keepNext/>
+      <w:keepLines/>
+    </w:pPr>
+    <w:rPr>
+      <w:sz w:val="24"/>
+      <w:szCs w:val="24"/>
     </w:rPr>
   </w:style>
   <w:style w:type="paragraph" w:customStyle="1" w:styleId="AbstractTitle">
-    <w:name w:val="Abstract Title" />
-    <w:basedOn w:val="Normal" />
-    <w:next w:val="Abstract" />
-    <w:qFormat />
-    <w:pPr>
-      <w:keepNext />
-      <w:keepLines />
-      <w:spacing w:before="300" w:after="0" />
-      <w:jc w:val="center" />
-    </w:pPr>
-    <w:rPr>
-      <w:b />
-      <w:sz w:val="20" />
-      <w:szCs w:val="20" />
+    <w:name w:val="Abstract Title"/>
+    <w:basedOn w:val="Normal"/>
+    <w:next w:val="Abstract"/>
+    <w:qFormat/>
+    <w:pPr>
+      <w:keepNext/>
+      <w:keepLines/>
+      <w:spacing w:before="300" w:after="0"/>
+      <w:jc w:val="center"/>
+    </w:pPr>
+    <w:rPr>
+      <w:b/>
+      <w:sz w:val="20"/>
+      <w:szCs w:val="20"/>
     </w:rPr>
   </w:style>
   <w:style w:type="paragraph" w:customStyle="1" w:styleId="Abstract">
-    <w:name w:val="Abstract" />
-    <w:basedOn w:val="Normal" />
-    <w:next w:val="BodyText" />
-    <w:qFormat />
-    <w:pPr>
-      <w:keepNext />
-      <w:keepLines />
-      <w:spacing w:before="100" w:after="300" />
-    </w:pPr>
-    <w:rPr>
-      <w:sz w:val="20" />
-      <w:szCs w:val="20" />
+    <w:name w:val="Abstract"/>
+    <w:basedOn w:val="Normal"/>
+    <w:next w:val="BodyText"/>
+    <w:qFormat/>
+    <w:pPr>
+      <w:keepNext/>
+      <w:keepLines/>
+      <w:spacing w:before="100" w:after="300"/>
+    </w:pPr>
+    <w:rPr>
+      <w:sz w:val="20"/>
+      <w:szCs w:val="20"/>
     </w:rPr>
   </w:style>
   <w:style w:type="paragraph" w:styleId="Bibliography">
-    <w:name w:val="Bibliography" />
-    <w:basedOn w:val="Normal" />
-    <w:next w:val="Bibliography" />
-    <w:qFormat />
-    <w:pPr />
-    <w:rPr />
+    <w:name w:val="Bibliography"/>
+    <w:basedOn w:val="Normal"/>
+    <w:next w:val="Bibliography"/>
+    <w:qFormat/>
+    <w:pPr/>
+    <w:rPr/>
   </w:style>
   <!-- Chapter headings: page break before, centered, roughly a third down the new
-       page, same 12pt Times New Roman as body text and NOT bold -- Shunn manuscript
+       page, same 12pt Times New Roman as body text and NOT bold — Shunn manuscript
        format doesn't distinguish chapter titles typographically from body text. -->
   <w:style w:type="paragraph" w:styleId="Heading1">
-    <w:name w:val="heading 1" />
-    <w:basedOn w:val="Normal" />
-    <w:next w:val="FirstParagraph" />
-    <w:link w:val="Heading1Char" />
-    <w:uiPriority w:val="9" />
-    <w:qFormat />
-    <w:rsid w:val="00A10FD9" />
-    <w:pPr>
-      <w:keepNext />
-      <w:keepLines />
-      <w:pageBreakBefore />
-      <w:spacing w:before="4320" w:after="720" w:line="240" w:lineRule="auto" />
-      <w:ind w:firstLine="0" />
-      <w:jc w:val="center" />
-      <w:outlineLvl w:val="0" />
-    </w:pPr>
-    <w:rPr>
-      <w:rFonts w:ascii="Times New Roman" w:eastAsia="Times New Roman" w:hAnsi="Times New Roman" w:cs="Times New Roman" />
-      <w:sz w:val="24" />
-      <w:szCs w:val="24" />
+    <w:name w:val="heading 1"/>
+    <w:basedOn w:val="Normal"/>
+    <w:next w:val="FirstParagraph"/>
+    <w:link w:val="Heading1Char"/>
+    <w:uiPriority w:val="9"/>
+    <w:qFormat/>
+    <w:rsid w:val="00A10FD9"/>
+    <w:pPr>
+      <w:keepNext/>
+      <w:keepLines/>
+      <w:spacing w:before="0" w:after="720" w:line="240" w:lineRule="auto"/>
+      <w:ind w:firstLine="0"/>
+      <w:jc w:val="center"/>
+      <w:outlineLvl w:val="0"/>
+    </w:pPr>
+    <w:rPr>
+      <w:rFonts w:ascii="Times New Roman" w:eastAsia="Times New Roman" w:hAnsi="Times New Roman" w:cs="Times New Roman"/>
+      <w:sz w:val="24"/>
+      <w:szCs w:val="24"/>
     </w:rPr>
   </w:style>
   <w:style w:type="paragraph" w:styleId="Heading2">
-    <w:name w:val="heading 2" />
-    <w:basedOn w:val="Normal" />
-    <w:next w:val="BodyText" />
-    <w:link w:val="Heading2Char" />
-    <w:uiPriority w:val="9" />
-    <w:semiHidden />
-    <w:unhideWhenUsed />
-    <w:qFormat />
-    <w:rsid w:val="00A10FD9" />
-    <w:pPr>
-      <w:keepNext />
-      <w:keepLines />
-      <w:spacing w:before="160" w:after="80" />
-      <w:outlineLvl w:val="1" />
-    </w:pPr>
-    <w:rPr>
-      <w:rFonts w:asciiTheme="majorHAnsi"
-      w:eastAsiaTheme="majorEastAsia" w:hAnsiTheme="majorHAnsi"
-      w:cstheme="majorBidi" />
-      <w:color w:val="0F4761" w:themeColor="accent1"
-      w:themeShade="BF" />
-      <w:sz w:val="32" />
-      <w:szCs w:val="32" />
+    <w:name w:val="heading 2"/>
+    <w:basedOn w:val="Normal"/>
+    <w:next w:val="BodyText"/>
+    <w:link w:val="Heading2Char"/>
+    <w:uiPriority w:val="9"/>
+    <w:semiHidden/>
+    <w:unhideWhenUsed/>
+    <w:qFormat/>
+    <w:rsid w:val="00A10FD9"/>
+    <w:pPr>
+      <w:keepNext/>
+      <w:keepLines/>
+      <w:spacing w:before="160" w:after="80"/>
+      <w:outlineLvl w:val="1"/>
+    </w:pPr>
+    <w:rPr>
+      <w:rFonts w:asciiTheme="majorHAnsi" w:eastAsiaTheme="majorEastAsia" w:hAnsiTheme="majorHAnsi" w:cstheme="majorBidi"/>
+      <w:color w:val="0F4761" w:themeColor="accent1" w:themeShade="BF"/>
+      <w:sz w:val="32"/>
+      <w:szCs w:val="32"/>
     </w:rPr>
   </w:style>
   <w:style w:type="paragraph" w:styleId="Heading3">
-    <w:name w:val="heading 3" />
-    <w:basedOn w:val="Normal" />
-    <w:next w:val="BodyText" />
-    <w:link w:val="Heading3Char" />
-    <w:uiPriority w:val="9" />
-    <w:semiHidden />
-    <w:unhideWhenUsed />
-    <w:qFormat />
-    <w:rsid w:val="00A10FD9" />
-    <w:pPr>
-      <w:keepNext />
-      <w:keepLines />
-      <w:spacing w:before="160" w:after="80" />
-      <w:outlineLvl w:val="2" />
-    </w:pPr>
-    <w:rPr>
-      <w:rFonts w:eastAsiaTheme="majorEastAsia"
-      w:cstheme="majorBidi" />
-      <w:color w:val="0F4761" w:themeColor="accent1"
-      w:themeShade="BF" />
-      <w:sz w:val="28" />
-      <w:szCs w:val="28" />
+    <w:name w:val="heading 3"/>
+    <w:basedOn w:val="Normal"/>
+    <w:next w:val="BodyText"/>
+    <w:link w:val="Heading3Char"/>
+    <w:uiPriority w:val="9"/>
+    <w:semiHidden/>
+    <w:unhideWhenUsed/>
+    <w:qFormat/>
+    <w:rsid w:val="00A10FD9"/>
+    <w:pPr>
+      <w:keepNext/>
+      <w:keepLines/>
+      <w:spacing w:before="160" w:after="80"/>
+      <w:outlineLvl w:val="2"/>
+    </w:pPr>
+    <w:rPr>
+      <w:rFonts w:eastAsiaTheme="majorEastAsia" w:cstheme="majorBidi"/>
+      <w:color w:val="0F4761" w:themeColor="accent1" w:themeShade="BF"/>
+      <w:sz w:val="28"/>
+      <w:szCs w:val="28"/>
     </w:rPr>
   </w:style>
   <w:style w:type="paragraph" w:styleId="Heading4">
-    <w:name w:val="heading 4" />
-    <w:basedOn w:val="Normal" />
-    <w:next w:val="BodyText" />
-    <w:link w:val="Heading4Char" />
-    <w:uiPriority w:val="9" />
-    <w:semiHidden />
-    <w:unhideWhenUsed />
-    <w:qFormat />
-    <w:rsid w:val="00A10FD9" />
-    <w:pPr>
-      <w:keepNext />
-      <w:keepLines />
-      <w:spacing w:before="80" w:after="40" />
-      <w:outlineLvl w:val="3" />
-    </w:pPr>
-    <w:rPr>
-      <w:rFonts w:eastAsiaTheme="majorEastAsia"
-      w:cstheme="majorBidi" />
-      <w:i />
-      <w:iCs />
-      <w:color w:val="0F4761" w:themeColor="accent1"
-      w:themeShade="BF" />
+    <w:name w:val="heading 4"/>
+    <w:basedOn w:val="Normal"/>
+    <w:next w:val="BodyText"/>
+    <w:link w:val="Heading4Char"/>
+    <w:uiPriority w:val="9"/>
+    <w:semiHidden/>
+    <w:unhideWhenUsed/>
+    <w:qFormat/>
+    <w:rsid w:val="00A10FD9"/>
+    <w:pPr>
+      <w:keepNext/>
+      <w:keepLines/>
+      <w:spacing w:before="80" w:after="40"/>
+      <w:outlineLvl w:val="3"/>
+    </w:pPr>
+    <w:rPr>
+      <w:rFonts w:eastAsiaTheme="majorEastAsia" w:cstheme="majorBidi"/>
+      <w:i/>
+      <w:iCs/>
+      <w:color w:val="0F4761" w:themeColor="accent1" w:themeShade="BF"/>
     </w:rPr>
   </w:style>
   <w:style w:type="paragraph" w:styleId="Heading5">
-    <w:name w:val="heading 5" />
-    <w:basedOn w:val="Normal" />
-    <w:next w:val="BodyText" />
-    <w:link w:val="Heading5Char" />
-    <w:uiPriority w:val="9" />
-    <w:semiHidden />
-    <w:unhideWhenUsed />
-    <w:qFormat />
-    <w:rsid w:val="00A10FD9" />
-    <w:pPr>
-      <w:keepNext />
-      <w:keepLines />
-      <w:spacing w:before="80" w:after="40" />
-      <w:outlineLvl w:val="4" />
-    </w:pPr>
-    <w:rPr>
-      <w:rFonts w:eastAsiaTheme="majorEastAsia"
-      w:cstheme="majorBidi" />
-      <w:color w:val="0F4761" w:themeColor="accent1"
-      w:themeShade="BF" />
+    <w:name w:val="heading 5"/>
+    <w:basedOn w:val="Normal"/>
+    <w:next w:val="BodyText"/>
+    <w:link w:val="Heading5Char"/>
+    <w:uiPriority w:val="9"/>
+    <w:semiHidden/>
+    <w:unhideWhenUsed/>
+    <w:qFormat/>
+    <w:rsid w:val="00A10FD9"/>
+    <w:pPr>
+      <w:keepNext/>
+      <w:keepLines/>
+      <w:spacing w:before="80" w:after="40"/>
+      <w:outlineLvl w:val="4"/>
+    </w:pPr>
+    <w:rPr>
+      <w:rFonts w:eastAsiaTheme="majorEastAsia" w:cstheme="majorBidi"/>
+      <w:color w:val="0F4761" w:themeColor="accent1" w:themeShade="BF"/>
     </w:rPr>
   </w:style>
   <w:style w:type="paragraph" w:styleId="Heading6">
-    <w:name w:val="heading 6" />
-    <w:basedOn w:val="Normal" />
-    <w:next w:val="BodyText" />
-    <w:link w:val="Heading6Char" />
-    <w:uiPriority w:val="9" />
-    <w:semiHidden />
-    <w:unhideWhenUsed />
-    <w:qFormat />
-    <w:rsid w:val="00A10FD9" />
-    <w:pPr>
-      <w:keepNext />
-      <w:keepLines />
-      <w:spacing w:before="40" w:after="0" />
-      <w:outlineLvl w:val="5" />
-    </w:pPr>
-    <w:rPr>
-      <w:rFonts w:eastAsiaTheme="majorEastAsia"
-      w:cstheme="majorBidi" />
-      <w:i />
-      <w:iCs />
-      <w:color w:val="595959" w:themeColor="text1"
-      w:themeTint="A6" />
+    <w:name w:val="heading 6"/>
+    <w:basedOn w:val="Normal"/>
+    <w:next w:val="BodyText"/>
+    <w:link w:val="Heading6Char"/>
+    <w:uiPriority w:val="9"/>
+    <w:semiHidden/>
+    <w:unhideWhenUsed/>
+    <w:qFormat/>
+    <w:rsid w:val="00A10FD9"/>
+    <w:pPr>
+      <w:keepNext/>
+      <w:keepLines/>
+      <w:spacing w:before="40" w:after="0"/>
+      <w:outlineLvl w:val="5"/>
+    </w:pPr>
+    <w:rPr>
+      <w:rFonts w:eastAsiaTheme="majorEastAsia" w:cstheme="majorBidi"/>
+      <w:i/>
+      <w:iCs/>
+      <w:color w:val="595959" w:themeColor="text1" w:themeTint="A6"/>
     </w:rPr>
   </w:style>
   <w:style w:type="paragraph" w:styleId="Heading7">
-    <w:name w:val="heading 7" />
-    <w:basedOn w:val="Normal" />
-    <w:next w:val="BodyText" />
-    <w:link w:val="Heading7Char" />
-    <w:uiPriority w:val="9" />
-    <w:semiHidden />
-    <w:unhideWhenUsed />
-    <w:qFormat />
-    <w:rsid w:val="00A10FD9" />
-    <w:pPr>
-      <w:keepNext />
-      <w:keepLines />
-      <w:spacing w:before="40" w:after="0" />
-      <w:outlineLvl w:val="6" />
-    </w:pPr>
-    <w:rPr>
-      <w:rFonts w:eastAsiaTheme="majorEastAsia"
-      w:cstheme="majorBidi" />
-      <w:color w:val="595959" w:themeColor="text1"
-      w:themeTint="A6" />
+    <w:name w:val="heading 7"/>
+    <w:basedOn w:val="Normal"/>
+    <w:next w:val="BodyText"/>
+    <w:link w:val="Heading7Char"/>
+    <w:uiPriority w:val="9"/>
+    <w:semiHidden/>
+    <w:unhideWhenUsed/>
+    <w:qFormat/>
+    <w:rsid w:val="00A10FD9"/>
+    <w:pPr>
+      <w:keepNext/>
+      <w:keepLines/>
+      <w:spacing w:before="40" w:after="0"/>
+      <w:outlineLvl w:val="6"/>
+    </w:pPr>
+    <w:rPr>
+      <w:rFonts w:eastAsiaTheme="majorEastAsia" w:cstheme="majorBidi"/>
+      <w:color w:val="595959" w:themeColor="text1" w:themeTint="A6"/>
     </w:rPr>
   </w:style>
   <w:style w:type="paragraph" w:styleId="Heading8">
-    <w:name w:val="heading 8" />
-    <w:basedOn w:val="Normal" />
-    <w:next w:val="BodyText" />
-    <w:link w:val="Heading8Char" />
-    <w:uiPriority w:val="9" />
-    <w:semiHidden />
-    <w:unhideWhenUsed />
-    <w:qFormat />
-    <w:rsid w:val="00A10FD9" />
-    <w:pPr>
-      <w:keepNext />
-      <w:keepLines />
-      <w:spacing w:after="0" />
-      <w:outlineLvl w:val="7" />
-    </w:pPr>
-    <w:rPr>
-      <w:rFonts w:eastAsiaTheme="majorEastAsia"
-      w:cstheme="majorBidi" />
-      <w:i />
-      <w:iCs />
-      <w:color w:val="272727" w:themeColor="text1"
-      w:themeTint="D8" />
+    <w:name w:val="heading 8"/>
+    <w:basedOn w:val="Normal"/>
+    <w:next w:val="BodyText"/>
+    <w:link w:val="Heading8Char"/>
+    <w:uiPriority w:val="9"/>
+    <w:semiHidden/>
+    <w:unhideWhenUsed/>
+    <w:qFormat/>
+    <w:rsid w:val="00A10FD9"/>
+    <w:pPr>
+      <w:keepNext/>
+      <w:keepLines/>
+      <w:spacing w:after="0"/>
+      <w:outlineLvl w:val="7"/>
+    </w:pPr>
+    <w:rPr>
+      <w:rFonts w:eastAsiaTheme="majorEastAsia" w:cstheme="majorBidi"/>
+      <w:i/>
+      <w:iCs/>
+      <w:color w:val="272727" w:themeColor="text1" w:themeTint="D8"/>
     </w:rPr>
   </w:style>
   <w:style w:type="paragraph" w:styleId="Heading9">
-    <w:name w:val="heading 9" />
-    <w:basedOn w:val="Normal" />
-    <w:next w:val="BodyText" />
-    <w:link w:val="Heading9Char" />
-    <w:uiPriority w:val="9" />
-    <w:semiHidden />
-    <w:unhideWhenUsed />
-    <w:qFormat />
-    <w:rsid w:val="00A10FD9" />
-    <w:pPr>
-      <w:keepNext />
-      <w:keepLines />
-      <w:spacing w:after="0" />
-      <w:outlineLvl w:val="8" />
-    </w:pPr>
-    <w:rPr>
-      <w:rFonts w:eastAsiaTheme="majorEastAsia"
-      w:cstheme="majorBidi" />
-      <w:color w:val="272727" w:themeColor="text1"
-      w:themeTint="D8" />
+    <w:name w:val="heading 9"/>
+    <w:basedOn w:val="Normal"/>
+    <w:next w:val="BodyText"/>
+    <w:link w:val="Heading9Char"/>
+    <w:uiPriority w:val="9"/>
+    <w:semiHidden/>
+    <w:unhideWhenUsed/>
+    <w:qFormat/>
+    <w:rsid w:val="00A10FD9"/>
+    <w:pPr>
+      <w:keepNext/>
+      <w:keepLines/>
+      <w:spacing w:after="0"/>
+      <w:outlineLvl w:val="8"/>
+    </w:pPr>
+    <w:rPr>
+      <w:rFonts w:eastAsiaTheme="majorEastAsia" w:cstheme="majorBidi"/>
+      <w:color w:val="272727" w:themeColor="text1" w:themeTint="D8"/>
     </w:rPr>
   </w:style>
   <w:style w:type="character" w:customStyle="1" w:styleId="Heading1Char">
-    <w:name w:val="Heading 1 Char" />
-    <w:basedOn w:val="DefaultParagraphFont" />
-    <w:link w:val="Heading1" />
-    <w:uiPriority w:val="9" />
-    <w:rsid w:val="00A10FD9" />
-    <w:rPr>
-      <w:rFonts w:asciiTheme="majorHAnsi"
-      w:eastAsiaTheme="majorEastAsia" w:hAnsiTheme="majorHAnsi"
-      w:cstheme="majorBidi" />
-      <w:color w:val="0F4761" w:themeColor="accent1"
-      w:themeShade="BF" />
-      <w:sz w:val="40" />
-      <w:szCs w:val="40" />
-    </w:rPr>
-  </w:style>
-  <w:style w:type="character" w:customStyle="1"
-  w:styleId="Heading2Char">
-    <w:name w:val="Heading 2 Char" />
-    <w:basedOn w:val="DefaultParagraphFont" />
-    <w:link w:val="Heading2" />
-    <w:uiPriority w:val="9" />
-    <w:semiHidden />
-    <w:rsid w:val="00A10FD9" />
-    <w:rPr>
-      <w:rFonts w:asciiTheme="majorHAnsi"
-      w:eastAsiaTheme="majorEastAsia" w:hAnsiTheme="majorHAnsi"
-      w:cstheme="majorBidi" />
-      <w:color w:val="0F4761" w:themeColor="accent1"
-      w:themeShade="BF" />
-      <w:sz w:val="32" />
-      <w:szCs w:val="32" />
-    </w:rPr>
-  </w:style>
-  <w:style w:type="character" w:customStyle="1"
-  w:styleId="Heading3Char">
-    <w:name w:val="Heading 3 Char" />
-    <w:basedOn w:val="DefaultParagraphFont" />
-    <w:link w:val="Heading3" />
-    <w:uiPriority w:val="9" />
-    <w:semiHidden />
-    <w:rsid w:val="00A10FD9" />
-    <w:rPr>
-      <w:rFonts w:eastAsiaTheme="majorEastAsia"
-      w:cstheme="majorBidi" />
-      <w:color w:val="0F4761" w:themeColor="accent1"
-      w:themeShade="BF" />
-      <w:sz w:val="28" />
-      <w:szCs w:val="28" />
-    </w:rPr>
-  </w:style>
-  <w:style w:type="character" w:customStyle="1"
-  w:styleId="Heading4Char">
-    <w:name w:val="Heading 4 Char" />
-    <w:basedOn w:val="DefaultParagraphFont" />
-    <w:link w:val="Heading4" />
-    <w:uiPriority w:val="9" />
-    <w:semiHidden />
-    <w:rsid w:val="00A10FD9" />
-    <w:rPr>
-      <w:rFonts w:eastAsiaTheme="majorEastAsia"
-      w:cstheme="majorBidi" />
-      <w:i />
-      <w:iCs />
-      <w:color w:val="0F4761" w:themeColor="accent1"
-      w:themeShade="BF" />
-    </w:rPr>
-  </w:style>
-  <w:style w:type="character" w:customStyle="1"
-  w:styleId="Heading5Char">
-    <w:name w:val="Heading 5 Char" />
-    <w:basedOn w:val="DefaultParagraphFont" />
-    <w:link w:val="Heading5" />
-    <w:uiPriority w:val="9" />
-    <w:semiHidden />
-    <w:rsid w:val="00A10FD9" />
-    <w:rPr>
-      <w:rFonts w:eastAsiaTheme="majorEastAsia"
-      w:cstheme="majorBidi" />
-      <w:color w:val="0F4761" w:themeColor="accent1"
-      w:themeShade="BF" />
-    </w:rPr>
-  </w:style>
-  <w:style w:type="character" w:customStyle="1"
-  w:styleId="Heading6Char">
-    <w:name w:val="Heading 6 Char" />
-    <w:basedOn w:val="DefaultParagraphFont" />
-    <w:link w:val="Heading6" />
-    <w:uiPriority w:val="9" />
-    <w:semiHidden />
-    <w:rsid w:val="00A10FD9" />
-    <w:rPr>
-      <w:rFonts w:eastAsiaTheme="majorEastAsia"
-      w:cstheme="majorBidi" />
-      <w:i />
-      <w:iCs />
-      <w:color w:val="595959" w:themeColor="text1"
-      w:themeTint="A6" />
-    </w:rPr>
-  </w:style>
-  <w:style w:type="character" w:customStyle="1"
-  w:styleId="Heading7Char">
-    <w:name w:val="Heading 7 Char" />
-    <w:basedOn w:val="DefaultParagraphFont" />
-    <w:link w:val="Heading7" />
-    <w:uiPriority w:val="9" />
-    <w:semiHidden />
-    <w:rsid w:val="00A10FD9" />
-    <w:rPr>
-      <w:rFonts w:eastAsiaTheme="majorEastAsia"
-      w:cstheme="majorBidi" />
-      <w:color w:val="595959" w:themeColor="text1"
-      w:themeTint="A6" />
-    </w:rPr>
-  </w:style>
-  <w:style w:type="character" w:customStyle="1"
-  w:styleId="Heading8Char">
-    <w:name w:val="Heading 8 Char" />
-    <w:basedOn w:val="DefaultParagraphFont" />
-    <w:link w:val="Heading8" />
-    <w:uiPriority w:val="9" />
-    <w:semiHidden />
-    <w:rsid w:val="00A10FD9" />
-    <w:rPr>
-      <w:rFonts w:eastAsiaTheme="majorEastAsia"
-      w:cstheme="majorBidi" />
-      <w:i />
-      <w:iCs />
-      <w:color w:val="272727" w:themeColor="text1"
-      w:themeTint="D8" />
-    </w:rPr>
-  </w:style>
-  <w:style w:type="character" w:customStyle="1"
-  w:styleId="Heading9Char">
-    <w:name w:val="Heading 9 Char" />
-    <w:basedOn w:val="DefaultParagraphFont" />
-    <w:link w:val="Heading9" />
-    <w:uiPriority w:val="9" />
-    <w:semiHidden />
-    <w:rsid w:val="00A10FD9" />
-    <w:rPr>
-      <w:rFonts w:eastAsiaTheme="majorEastAsia"
-      w:cstheme="majorBidi" />
-      <w:color w:val="272727" w:themeColor="text1"
-      w:themeTint="D8" />
+    <w:name w:val="Heading 1 Char"/>
+    <w:basedOn w:val="DefaultParagraphFont"/>
+    <w:link w:val="Heading1"/>
+    <w:uiPriority w:val="9"/>
+    <w:rsid w:val="00A10FD9"/>
+    <w:rPr>
+      <w:rFonts w:asciiTheme="majorHAnsi" w:eastAsiaTheme="majorEastAsia" w:hAnsiTheme="majorHAnsi" w:cstheme="majorBidi"/>
+      <w:color w:val="0F4761" w:themeColor="accent1" w:themeShade="BF"/>
+      <w:sz w:val="40"/>
+      <w:szCs w:val="40"/>
+    </w:rPr>
+  </w:style>
+  <w:style w:type="character" w:customStyle="1" w:styleId="Heading2Char">
+    <w:name w:val="Heading 2 Char"/>
+    <w:basedOn w:val="DefaultParagraphFont"/>
+    <w:link w:val="Heading2"/>
+    <w:uiPriority w:val="9"/>
+    <w:semiHidden/>
+    <w:rsid w:val="00A10FD9"/>
+    <w:rPr>
+      <w:rFonts w:asciiTheme="majorHAnsi" w:eastAsiaTheme="majorEastAsia" w:hAnsiTheme="majorHAnsi" w:cstheme="majorBidi"/>
+      <w:color w:val="0F4761" w:themeColor="accent1" w:themeShade="BF"/>
+      <w:sz w:val="32"/>
+      <w:szCs w:val="32"/>
+    </w:rPr>
+  </w:style>
+  <w:style w:type="character" w:customStyle="1" w:styleId="Heading3Char">
+    <w:name w:val="Heading 3 Char"/>
+    <w:basedOn w:val="DefaultParagraphFont"/>
+    <w:link w:val="Heading3"/>
+    <w:uiPriority w:val="9"/>
+    <w:semiHidden/>
+    <w:rsid w:val="00A10FD9"/>
+    <w:rPr>
+      <w:rFonts w:eastAsiaTheme="majorEastAsia" w:cstheme="majorBidi"/>
+      <w:color w:val="0F4761" w:themeColor="accent1" w:themeShade="BF"/>
+      <w:sz w:val="28"/>
+      <w:szCs w:val="28"/>
+    </w:rPr>
+  </w:style>
+  <w:style w:type="character" w:customStyle="1" w:styleId="Heading4Char">
+    <w:name w:val="Heading 4 Char"/>
+    <w:basedOn w:val="DefaultParagraphFont"/>
+    <w:link w:val="Heading4"/>
+    <w:uiPriority w:val="9"/>
+    <w:semiHidden/>
+    <w:rsid w:val="00A10FD9"/>
+    <w:rPr>
+      <w:rFonts w:eastAsiaTheme="majorEastAsia" w:cstheme="majorBidi"/>
+      <w:i/>
+      <w:iCs/>
+      <w:color w:val="0F4761" w:themeColor="accent1" w:themeShade="BF"/>
+    </w:rPr>
+  </w:style>
+  <w:style w:type="character" w:customStyle="1" w:styleId="Heading5Char">
+    <w:name w:val="Heading 5 Char"/>
+    <w:basedOn w:val="DefaultParagraphFont"/>
+    <w:link w:val="Heading5"/>
+    <w:uiPriority w:val="9"/>
+    <w:semiHidden/>
+    <w:rsid w:val="00A10FD9"/>
+    <w:rPr>
+      <w:rFonts w:eastAsiaTheme="majorEastAsia" w:cstheme="majorBidi"/>
+      <w:color w:val="0F4761" w:themeColor="accent1" w:themeShade="BF"/>
+    </w:rPr>
+  </w:style>
+  <w:style w:type="character" w:customStyle="1" w:styleId="Heading6Char">
+    <w:name w:val="Heading 6 Char"/>
+    <w:basedOn w:val="DefaultParagraphFont"/>
+    <w:link w:val="Heading6"/>
+    <w:uiPriority w:val="9"/>
+    <w:semiHidden/>
+    <w:rsid w:val="00A10FD9"/>
+    <w:rPr>
+      <w:rFonts w:eastAsiaTheme="majorEastAsia" w:cstheme="majorBidi"/>
+      <w:i/>
+      <w:iCs/>
+      <w:color w:val="595959" w:themeColor="text1" w:themeTint="A6"/>
+    </w:rPr>
+  </w:style>
+  <w:style w:type="character" w:customStyle="1" w:styleId="Heading7Char">
+    <w:name w:val="Heading 7 Char"/>
+    <w:basedOn w:val="DefaultParagraphFont"/>
+    <w:link w:val="Heading7"/>
+    <w:uiPriority w:val="9"/>
+    <w:semiHidden/>
+    <w:rsid w:val="00A10FD9"/>
+    <w:rPr>
+      <w:rFonts w:eastAsiaTheme="majorEastAsia" w:cstheme="majorBidi"/>
+      <w:color w:val="595959" w:themeColor="text1" w:themeTint="A6"/>
+    </w:rPr>
+  </w:style>
+  <w:style w:type="character" w:customStyle="1" w:styleId="Heading8Char">
+    <w:name w:val="Heading 8 Char"/>
+    <w:basedOn w:val="DefaultParagraphFont"/>
+    <w:link w:val="Heading8"/>
+    <w:uiPriority w:val="9"/>
+    <w:semiHidden/>
+    <w:rsid w:val="00A10FD9"/>
+    <w:rPr>
+      <w:rFonts w:eastAsiaTheme="majorEastAsia" w:cstheme="majorBidi"/>
+      <w:i/>
+      <w:iCs/>
+      <w:color w:val="272727" w:themeColor="text1" w:themeTint="D8"/>
+    </w:rPr>
+  </w:style>
+  <w:style w:type="character" w:customStyle="1" w:styleId="Heading9Char">
+    <w:name w:val="Heading 9 Char"/>
+    <w:basedOn w:val="DefaultParagraphFont"/>
+    <w:link w:val="Heading9"/>
+    <w:uiPriority w:val="9"/>
+    <w:semiHidden/>
+    <w:rsid w:val="00A10FD9"/>
+    <w:rPr>
+      <w:rFonts w:eastAsiaTheme="majorEastAsia" w:cstheme="majorBidi"/>
+      <w:color w:val="272727" w:themeColor="text1" w:themeTint="D8"/>
     </w:rPr>
   </w:style>
   <w:style w:type="paragraph" w:styleId="BlockText">
-    <w:name w:val="Block Text" />
-    <w:basedOn w:val="BodyText" />
-    <w:next w:val="BodyText" />
-    <w:uiPriority w:val="9" />
-    <w:unhideWhenUsed />
-    <w:qFormat />
-    <w:pPr>
-      <w:spacing w:before="100" w:after="100" />
-      <w:ind w:firstLine="0" w:left="480" w:right="480" />
+    <w:name w:val="Block Text"/>
+    <w:basedOn w:val="BodyText"/>
+    <w:next w:val="BodyText"/>
+    <w:uiPriority w:val="9"/>
+    <w:unhideWhenUsed/>
+    <w:qFormat/>
+    <w:pPr>
+      <w:spacing w:before="100" w:after="100"/>
+      <w:ind w:firstLine="0" w:left="480" w:right="480"/>
     </w:pPr>
   </w:style>
   <w:style w:type="paragraph" w:styleId="FootnoteText">
-    <w:name w:val="Footnote Text" />
-    <w:basedOn w:val="Normal" />
-    <w:next w:val="FootnoteText" />
-    <w:uiPriority w:val="9" />
-    <w:unhideWhenUsed />
-    <w:qFormat />
+    <w:name w:val="Footnote Text"/>
+    <w:basedOn w:val="Normal"/>
+    <w:next w:val="FootnoteText"/>
+    <w:uiPriority w:val="9"/>
+    <w:unhideWhenUsed/>
+    <w:qFormat/>
   </w:style>
   <w:style w:type="paragraph" w:styleId="FootnoteBlockText">
-    <w:name w:val="Footnote Block Text" />
-    <w:basedOn w:val="FootnoteText" />
-    <w:next w:val="FootnoteText" />
-    <w:uiPriority w:val="9" />
-    <w:unhideWhenUsed />
-    <w:qFormat />
-    <w:pPr>
-      <w:spacing w:before="100" w:after="100" />
-      <w:ind w:firstLine="0" w:left="480" w:right="480" />
+    <w:name w:val="Footnote Block Text"/>
+    <w:basedOn w:val="FootnoteText"/>
+    <w:next w:val="FootnoteText"/>
+    <w:uiPriority w:val="9"/>
+    <w:unhideWhenUsed/>
+    <w:qFormat/>
+    <w:pPr>
+      <w:spacing w:before="100" w:after="100"/>
+      <w:ind w:firstLine="0" w:left="480" w:right="480"/>
     </w:pPr>
   </w:style>
   <w:style w:type="character" w:default="1" w:styleId="DefaultParagraphFont">
-    <w:name w:val="Default Paragraph Font" />
-    <w:semiHidden />
-    <w:unhideWhenUsed />
+    <w:name w:val="Default Paragraph Font"/>
+    <w:semiHidden/>
+    <w:unhideWhenUsed/>
   </w:style>
   <w:style w:type="table" w:default="1" w:styleId="Table">
-    <w:name w:val="Table" />
-    <w:basedOn w:val="TableNormal" />
-    <w:semiHidden />
-    <w:unhideWhenUsed />
-    <w:qFormat />
+    <w:name w:val="Table"/>
+    <w:basedOn w:val="TableNormal"/>
+    <w:semiHidden/>
+    <w:unhideWhenUsed/>
+    <w:qFormat/>
     <w:tblPr>
-      <w:tblInd w:w="0" w:type="dxa" />
+      <w:tblInd w:w="0" w:type="dxa"/>
       <w:tblCellMar>
-        <w:top w:w="0" w:type="dxa" />
-        <w:left w:w="108" w:type="dxa" />
-        <w:bottom w:w="0" w:type="dxa" />
-        <w:right w:w="108" w:type="dxa" />
+        <w:top w:w="0" w:type="dxa"/>
+        <w:left w:w="108" w:type="dxa"/>
+        <w:bottom w:w="0" w:type="dxa"/>
+        <w:right w:w="108" w:type="dxa"/>
       </w:tblCellMar>
     </w:tblPr>
     <w:tblStylePr w:type="firstRow">
@@ -1120,106 +1086,182 @@
     </w:tblStylePr>
   </w:style>
   <w:style w:type="paragraph" w:customStyle="1" w:styleId="DefinitionTerm">
-    <w:name w:val="Definition Term" />
-    <w:basedOn w:val="Normal" />
-    <w:next w:val="Definition" />
-    <w:pPr>
-      <w:keepNext />
-      <w:keepLines />
-      <w:spacing w:after="0" />
-    </w:pPr>
-    <w:rPr>
-      <w:b />
+    <w:name w:val="Definition Term"/>
+    <w:basedOn w:val="Normal"/>
+    <w:next w:val="Definition"/>
+    <w:pPr>
+      <w:keepNext/>
+      <w:keepLines/>
+      <w:spacing w:after="0"/>
+    </w:pPr>
+    <w:rPr>
+      <w:b/>
     </w:rPr>
   </w:style>
   <w:style w:type="paragraph" w:customStyle="1" w:styleId="Definition">
-    <w:name w:val="Definition" />
-    <w:basedOn w:val="Normal" />
+    <w:name w:val="Definition"/>
+    <w:basedOn w:val="Normal"/>
   </w:style>
   <w:style w:type="paragraph" w:styleId="Caption">
-    <w:name w:val="Caption" />
-    <w:basedOn w:val="Normal" />
-    <w:link w:val="BodyTextChar" />
-    <w:pPr>
-      <w:spacing w:before="0" w:after="120" />
-    </w:pPr>
-    <w:rPr>
-      <w:i />
+    <w:name w:val="Caption"/>
+    <w:basedOn w:val="Normal"/>
+    <w:link w:val="BodyTextChar"/>
+    <w:pPr>
+      <w:spacing w:before="0" w:after="120"/>
+    </w:pPr>
+    <w:rPr>
+      <w:i/>
     </w:rPr>
   </w:style>
   <w:style w:type="paragraph" w:customStyle="1" w:styleId="TableCaption">
-    <w:name w:val="Table Caption" />
-    <w:basedOn w:val="Caption" />
-    <w:pPr>
-      <w:keepNext />
+    <w:name w:val="Table Caption"/>
+    <w:basedOn w:val="Caption"/>
+    <w:pPr>
+      <w:keepNext/>
     </w:pPr>
   </w:style>
   <w:style w:type="paragraph" w:customStyle="1" w:styleId="ImageCaption">
-    <w:name w:val="Image Caption" />
-    <w:basedOn w:val="Caption" />
+    <w:name w:val="Image Caption"/>
+    <w:basedOn w:val="Caption"/>
   </w:style>
   <w:style w:type="paragraph" w:customStyle="1" w:styleId="Figure">
-    <w:name w:val="Figure" />
-    <w:basedOn w:val="Normal" />
+    <w:name w:val="Figure"/>
+    <w:basedOn w:val="Normal"/>
   </w:style>
   <w:style w:type="paragraph" w:customStyle="1" w:styleId="CaptionedFigure">
-    <w:name w:val="Captioned Figure" />
-    <w:basedOn w:val="Figure" />
-    <w:pPr>
-      <w:keepNext />
+    <w:name w:val="Captioned Figure"/>
+    <w:basedOn w:val="Figure"/>
+    <w:pPr>
+      <w:keepNext/>
     </w:pPr>
   </w:style>
   <w:style w:type="character" w:customStyle="1" w:styleId="BodyTextChar">
-    <w:name w:val="Body Text Char" />
-    <w:basedOn w:val="DefaultParagraphFont" />
-    <w:link w:val="BodyText" />
+    <w:name w:val="Body Text Char"/>
+    <w:basedOn w:val="DefaultParagraphFont"/>
+    <w:link w:val="BodyText"/>
   </w:style>
   <w:style w:type="character" w:customStyle="1" w:styleId="VerbatimChar">
-    <w:name w:val="Verbatim Char" />
-    <w:basedOn w:val="BodyTextChar" />
-    <w:rPr>
-      <w:rFonts w:ascii="Consolas" w:hAnsi="Consolas" />
-      <w:sz w:val="22" />
+    <w:name w:val="Verbatim Char"/>
+    <w:basedOn w:val="BodyTextChar"/>
+    <w:rPr>
+      <w:rFonts w:ascii="Consolas" w:hAnsi="Consolas"/>
+      <w:sz w:val="22"/>
     </w:rPr>
   </w:style>
   <w:style w:type="character" w:customStyle="1" w:styleId="SectionNumber">
-    <w:name w:val="Section Number" />
-    <w:basedOn w:val="BodyTextChar" />
+    <w:name w:val="Section Number"/>
+    <w:basedOn w:val="BodyTextChar"/>
   </w:style>
   <w:style w:type="character" w:styleId="FootnoteReference">
-    <w:name w:val="Footnote Reference" />
-    <w:basedOn w:val="BodyTextChar" />
-    <w:rPr>
-      <w:vertAlign w:val="superscript" />
+    <w:name w:val="Footnote Reference"/>
+    <w:basedOn w:val="BodyTextChar"/>
+    <w:rPr>
+      <w:vertAlign w:val="superscript"/>
     </w:rPr>
   </w:style>
   <w:style w:type="character" w:styleId="Hyperlink">
-    <w:name w:val="Hyperlink" />
-    <w:basedOn w:val="BodyTextChar" />
-    <w:rPr>
-      <w:color w:val="4F81BD" w:themeColor="accent1" />
+    <w:name w:val="Hyperlink"/>
+    <w:basedOn w:val="BodyTextChar"/>
+    <w:rPr>
+      <w:color w:val="4F81BD" w:themeColor="accent1"/>
     </w:rPr>
   </w:style>
   <w:style w:type="paragraph" w:styleId="TOCHeading">
-    <w:name w:val="TOC Heading" />
-    <w:basedOn w:val="Heading1" />
-    <w:next w:val="BodyText" />
-    <w:uiPriority w:val="39" />
-    <w:unhideWhenUsed />
-    <w:qFormat />
-    <w:pPr>
-      <w:spacing w:before="240" w:line="259" w:lineRule="auto" />
-      <w:outlineLvl w:val="9" />
-    </w:pPr>
-    <w:rPr>
-      <w:rFonts w:asciiTheme="majorHAnsi" w:eastAsiaTheme="majorEastAsia" w:hAnsiTheme="majorHAnsi" w:cstheme="majorBidi" />
-      <w:b w:val="0" />
-      <w:bCs w:val="0" />
-      <w:color w:val="365F91" w:themeColor="accent1" w:themeShade="BF" />
-    </w:rPr>
+    <w:name w:val="TOC Heading"/>
+    <w:basedOn w:val="Heading1"/>
+    <w:next w:val="BodyText"/>
+    <w:uiPriority w:val="39"/>
+    <w:unhideWhenUsed/>
+    <w:qFormat/>
+    <w:pPr>
+      <w:spacing w:before="240" w:line="259" w:lineRule="auto"/>
+      <w:outlineLvl w:val="9"/>
+    </w:pPr>
+    <w:rPr>
+      <w:rFonts w:asciiTheme="majorHAnsi" w:eastAsiaTheme="majorEastAsia" w:hAnsiTheme="majorHAnsi" w:cstheme="majorBidi"/>
+      <w:b w:val="0"/>
+      <w:bCs w:val="0"/>
+      <w:color w:val="365F91" w:themeColor="accent1" w:themeShade="BF"/>
+    </w:rPr>
+  </w:style>
+  <!-- Standard Manuscript Format title page (§ SMFTitlePageBuilder): contact block
+       top-left with a right tab stop for the word count, centered title roughly
+       41% down the page, centered byline just below it, and a right-aligned running
+       header used on interior pages via header1.xml. -->
+  <w:style w:type="paragraph" w:customStyle="1" w:styleId="SMFContact">
+    <w:name w:val="SMF Contact"/>
+    <w:basedOn w:val="Normal"/>
+    <w:qFormat/>
+    <w:pPr>
+      <w:tabs>
+        <w:tab w:val="right" w:pos="9360"/>
+      </w:tabs>
+      <w:spacing w:before="0" w:after="0" w:line="240" w:lineRule="auto"/>
+      <w:ind w:firstLine="0"/>
+      <w:jc w:val="left"/>
+    </w:pPr>
+  </w:style>
+  <w:style w:type="paragraph" w:customStyle="1" w:styleId="SMFTitle">
+    <w:name w:val="SMF Title"/>
+    <w:basedOn w:val="Normal"/>
+    <w:qFormat/>
+    <w:pPr>
+      <w:spacing w:before="5040" w:after="0" w:line="240" w:lineRule="auto"/>
+      <w:ind w:firstLine="0"/>
+      <w:jc w:val="center"/>
+    </w:pPr>
+  </w:style>
+  <w:style w:type="paragraph" w:customStyle="1" w:styleId="SMFByline">
+    <w:name w:val="SMF Byline"/>
+    <w:basedOn w:val="Normal"/>
+    <w:qFormat/>
+    <w:pPr>
+      <w:spacing w:before="240" w:after="0" w:line="240" w:lineRule="auto"/>
+      <w:ind w:firstLine="0"/>
+      <w:jc w:val="center"/>
+    </w:pPr>
+  </w:style>
+  <w:style w:type="paragraph" w:customStyle="1" w:styleId="SMFHeader">
+    <w:name w:val="SMF Header"/>
+    <w:basedOn w:val="Normal"/>
+    <w:qFormat/>
+    <w:pPr>
+      <w:spacing w:before="0" w:after="0" w:line="240" w:lineRule="auto"/>
+      <w:ind w:firstLine="0"/>
+      <w:jc w:val="right"/>
+    </w:pPr>
+  </w:style>
+  <w:style w:type="paragraph" w:customStyle="1" w:styleId="ChapterSpacer">
+    <w:name w:val="Chapter Spacer"/>
+    <w:basedOn w:val="Normal"/>
+    <w:qFormat/>
+    <w:pPr>
+      <w:spacing w:before="0" w:after="0" w:line="240" w:lineRule="auto"/>
+      <w:ind w:firstLine="0"/>
+      <w:jc w:val="left"/>
+    </w:pPr>
+  </w:style>
+  <w:style w:type="paragraph" w:customStyle="1" w:styleId="SMFEndMark">
+    <w:name w:val="SMF End Mark"/>
+    <w:basedOn w:val="Normal"/>
+    <w:qFormat/>
+    <w:pPr>
+      <w:spacing w:before="480" w:after="0" w:line="240" w:lineRule="auto"/>
+      <w:ind w:firstLine="0"/>
+      <w:jc w:val="center"/>
+    </w:pPr>
+  </w:style>
+  <w:style w:type="paragraph" w:customStyle="1" w:styleId="SMFSceneBreak">
+    <w:name w:val="SMF Scene Break"/>
+    <w:basedOn w:val="Normal"/>
+    <w:qFormat/>
+    <w:pPr>
+      <w:spacing w:before="0" w:after="0" w:line="480" w:lineRule="auto"/>
+      <w:ind w:firstLine="0"/>
+      <w:jc w:val="center"/>
+    </w:pPr>
   </w:style>
 </w:styles>
-
 </file>
 
 <file path=word/theme/theme1.xml><?xml version="1.0" encoding="utf-8"?>

</xml_diff>